<commit_message>
Add laboratory reference intervals for TSH and free T4
TSH 0.7-5.7 mIU/L, free T4 10-22 pmol/L (pediatric laboratory ranges
provided by the authors), in Methods and in the response letter.

Co-Authored-By: Claude Opus 5.5 <noreply@anthropic.com>
Claude-Session: https://claude.ai/code/session_01Bi2cfojWAwQft33j1pXos8
</commit_message>
<xml_diff>
--- a/Статья_исправленная.docx
+++ b/Статья_исправленная.docx
@@ -574,52 +574,7 @@
         </w:rPr>
       </w:pPr>
       <w:r>
-        <w:t xml:space="preserve">У всех пациентов определяли ТТГ, 25(OH)D и HbA1c; свободный Т4 исследовали только при повышенном ТТГ. Результаты ТТГ и свободного Т4 оценивали по возрастным референсным интервалам лаборатории: ТТГ </w:t>
-      </w:r>
-      <w:r>
-        <w:rPr>
-          <w:highlight w:val="yellow"/>
-        </w:rPr>
-        <w:t xml:space="preserve">__-__</w:t>
-      </w:r>
-      <w:r>
-        <w:t xml:space="preserve"> мМЕ/л для детей </w:t>
-      </w:r>
-      <w:r>
-        <w:rPr>
-          <w:highlight w:val="yellow"/>
-        </w:rPr>
-        <w:t xml:space="preserve">__-__</w:t>
-      </w:r>
-      <w:r>
-        <w:t xml:space="preserve"> лет и </w:t>
-      </w:r>
-      <w:r>
-        <w:rPr>
-          <w:highlight w:val="yellow"/>
-        </w:rPr>
-        <w:t xml:space="preserve">__-__</w:t>
-      </w:r>
-      <w:r>
-        <w:t xml:space="preserve"> мМЕ/л для детей </w:t>
-      </w:r>
-      <w:r>
-        <w:rPr>
-          <w:highlight w:val="yellow"/>
-        </w:rPr>
-        <w:t xml:space="preserve">__-__</w:t>
-      </w:r>
-      <w:r>
-        <w:t xml:space="preserve"> лет, свободный Т4 </w:t>
-      </w:r>
-      <w:r>
-        <w:rPr>
-          <w:highlight w:val="yellow"/>
-        </w:rPr>
-        <w:t xml:space="preserve">__-__</w:t>
-      </w:r>
-      <w:r>
-        <w:t xml:space="preserve"> пмоль/л. Субклиническим гипотиреозом считали повышение ТТГ при нормальном свободном Т4, манифестным — повышение ТТГ при свободном Т4 ниже референсного интервала. </w:t>
+        <w:t xml:space="preserve">У всех пациентов определяли ТТГ, 25(OH)D и HbA1c; свободный Т4 исследовали только при повышенном ТТГ. Результаты оценивали по педиатрическим референсным интервалам лаборатории: ТТГ 0,7-5,7 мМЕ/л, свободный Т4 10-22 пмоль/л. Субклиническим гипотиреозом считали повышение ТТГ при нормальном свободном Т4, манифестным — повышение ТТГ при свободном Т4 ниже референсного интервала. </w:t>
       </w:r>
       <w:r>
         <w:rPr>

</xml_diff>

<commit_message>
Remove verification highlights after authors confirmed the protocol details
Co-Authored-By: Claude Opus 5.5 <noreply@anthropic.com>
Claude-Session: https://claude.ai/code/session_01Bi2cfojWAwQft33j1pXos8
</commit_message>
<xml_diff>
--- a/Статья_исправленная.docx
+++ b/Статья_исправленная.docx
@@ -504,33 +504,18 @@
         </w:rPr>
       </w:pPr>
       <w:r>
-        <w:rPr>
-          <w:highlight w:val="cyan"/>
-        </w:rPr>
-        <w:t xml:space="preserve">Сахарный диабет диагностировали по критериям ISPAD 2022 </w:t>
-      </w:r>
-      <w:r>
-        <w:t xml:space="preserve">[22]</w:t>
-      </w:r>
-      <w:r>
-        <w:rPr>
-          <w:highlight w:val="cyan"/>
-        </w:rPr>
-        <w:t xml:space="preserve">: глюкоза плазмы натощак 7,0 ммоль/л и выше, случайное значение глюкозы 11,1 ммоль/л и выше при классических симптомах или HbA1c 6,5% и выше. Тип диабета определяли по клинической картине: острое начало с полиурией, полидипсией и снижением массы тела, а также потребность в инсулине с момента диагностики. Наличие островковых аутоантител не было обязательным условием включения. Впервые выявленным считали СД 1 типа, диагностированный во время данной госпитализации.</w:t>
-      </w:r>
-    </w:p>
-    <w:p>
-      <w:pPr>
-        <w:spacing w:line="360" w:lineRule="auto"/>
-        <w:jc w:val="both"/>
-        <w:rPr>
-          <w:szCs w:val="28"/>
-        </w:rPr>
-      </w:pPr>
-      <w:r>
-        <w:rPr>
-          <w:highlight w:val="cyan"/>
-        </w:rPr>
+        <w:t xml:space="preserve">Сахарный диабет диагностировали по критериям ISPAD 2022 [22]: глюкоза плазмы натощак 7,0 ммоль/л и выше, случайное значение глюкозы 11,1 ммоль/л и выше при классических симптомах или HbA1c 6,5% и выше. Тип диабета определяли по клинической картине: острое начало с полиурией, полидипсией и снижением массы тела, а также потребность в инсулине с момента диагностики. Наличие островковых аутоантител не было обязательным условием включения. Впервые выявленным считали СД 1 типа, диагностированный во время данной госпитализации.</w:t>
+      </w:r>
+    </w:p>
+    <w:p>
+      <w:pPr>
+        <w:spacing w:line="360" w:lineRule="auto"/>
+        <w:jc w:val="both"/>
+        <w:rPr>
+          <w:szCs w:val="28"/>
+        </w:rPr>
+      </w:pPr>
+      <w:r>
         <w:t xml:space="preserve">Критерии включения: возраст до 18 лет, впервые установленный СД 1 типа, письменное информированное согласие родителей или законных представителей. Критерии исключения: СД 2 типа, клинически заподозренный моногенный диабет, вторичный диабет, заболевания щитовидной железы, диагностированные до госпитализации, а также приём левотироксина, тиреостатиков или глюкокортикоидов.</w:t>
       </w:r>
     </w:p>
@@ -543,13 +528,7 @@
         </w:rPr>
       </w:pPr>
       <w:r>
-        <w:rPr>
-          <w:highlight w:val="cyan"/>
-        </w:rPr>
-        <w:t xml:space="preserve">Кровь для всех исследований брали однократно в период госпитализации.</w:t>
-      </w:r>
-      <w:r>
-        <w:t xml:space="preserve"> Время взятия крови относительно первой инъекции инсулина в протоколе не фиксировали.</w:t>
+        <w:t xml:space="preserve">Кровь для всех исследований брали однократно в период госпитализации. Время взятия крови относительно первой инъекции инсулина в протоколе не фиксировали.</w:t>
       </w:r>
     </w:p>
     <w:p>
@@ -574,16 +553,7 @@
         </w:rPr>
       </w:pPr>
       <w:r>
-        <w:t xml:space="preserve">У всех пациентов определяли ТТГ, 25(OH)D и HbA1c; свободный Т4 исследовали только при повышенном ТТГ. Результаты оценивали по педиатрическим референсным интервалам лаборатории: ТТГ 0,7-5,7 мМЕ/л, свободный Т4 10-22 пмоль/л. Субклиническим гипотиреозом считали повышение ТТГ при нормальном свободном Т4, манифестным — повышение ТТГ при свободном Т4 ниже референсного интервала. </w:t>
-      </w:r>
-      <w:r>
-        <w:rPr>
-          <w:highlight w:val="cyan"/>
-        </w:rPr>
-        <w:t xml:space="preserve">Дефицитом витамина D считали концентрацию 25(OH)D ниже 20 нг/мл (50 нмоль/л) </w:t>
-      </w:r>
-      <w:r>
-        <w:t xml:space="preserve">[14]. Положительный результат по АТ-ТПО обозначали как тиреоидный аутоиммунитет. Аутоиммунный тиреоидит не диагностировали, поскольку антитела к тиреоглобулину и УЗИ щитовидной железы не входили в протокол.</w:t>
+        <w:t xml:space="preserve">У всех пациентов определяли ТТГ, 25(OH)D и HbA1c; свободный Т4 исследовали только при повышенном ТТГ. Результаты оценивали по педиатрическим референсным интервалам лаборатории: ТТГ 0,7-5,7 мМЕ/л, свободный Т4 10-22 пмоль/л. Субклиническим гипотиреозом считали повышение ТТГ при нормальном свободном Т4, манифестным — повышение ТТГ при свободном Т4 ниже референсного интервала. Дефицитом витамина D считали концентрацию 25(OH)D ниже 20 нг/мл (50 нмоль/л) [14]. Положительный результат по АТ-ТПО обозначали как тиреоидный аутоиммунитет. Аутоиммунный тиреоидит не диагностировали, поскольку антитела к тиреоглобулину и УЗИ щитовидной железы не входили в протокол.</w:t>
       </w:r>
     </w:p>
     <w:p>
@@ -607,19 +577,7 @@
         </w:rPr>
       </w:pPr>
       <w:r>
-        <w:rPr>
-          <w:highlight w:val="cyan"/>
-        </w:rPr>
-        <w:t xml:space="preserve">Исследование проведено в соответствии с Хельсинкской декларацией и одобрено локальным этическим комитетом РСНПМЦЭ </w:t>
-      </w:r>
-      <w:r>
-        <w:t xml:space="preserve">(протокол № 12 от 15.01.2021). </w:t>
-      </w:r>
-      <w:r>
-        <w:rPr>
-          <w:highlight w:val="cyan"/>
-        </w:rPr>
-        <w:t xml:space="preserve">Родители или законные представители всех детей подписали информированное согласие на участие в исследовании.</w:t>
+        <w:t xml:space="preserve">Исследование проведено в соответствии с Хельсинкской декларацией и одобрено локальным этическим комитетом РСНПМЦЭ (протокол № 12 от 15.01.2021). Родители или законные представители всех детей подписали информированное согласие на участие в исследовании.</w:t>
       </w:r>
     </w:p>
     <w:p>
@@ -2763,16 +2721,7 @@
         </w:rPr>
       </w:pPr>
       <w:r>
-        <w:t xml:space="preserve">Ограничения исследования. Исследование выполнено в одном центре на небольшой выборке, поэтому его результаты нельзя распространять на всех детей с СД 1 типа в Узбекистане. Пациентов набирали в два периода (2021-2022 и 2025-2026 годы). За это время могли измениться состав госпитализированных детей и партии диагностических наборов, а число пациентов в каждом периоде слишком мало для их отдельного сравнения. Контрольной группы не было. Панель островковых аутоантител была неполной: ICA и антитела к IA-2 и ZnT8 не определяли. </w:t>
-      </w:r>
-      <w:r>
-        <w:rPr>
-          <w:highlight w:val="cyan"/>
-        </w:rPr>
-        <w:t xml:space="preserve">С-пептид и генетическое обследование не проводили, поэтому моногенный диабет исключали только клинически.</w:t>
-      </w:r>
-      <w:r>
-        <w:t xml:space="preserve"> Время взятия крови относительно начала инсулинотерапии не фиксировали, что затрудняет интерпретацию АТ-IAA. Дети с ранее известными заболеваниями щитовидной железы не включались, что могло занизить частоту тиреоидной патологии. Аутоиммунный тиреоидит не верифицировали, а функцию щитовидной железы оценивали однократно при установлении диагноза.</w:t>
+        <w:t xml:space="preserve">Ограничения исследования. Исследование выполнено в одном центре на небольшой выборке, поэтому его результаты нельзя распространять на всех детей с СД 1 типа в Узбекистане. Пациентов набирали в два периода (2021-2022 и 2025-2026 годы). За это время могли измениться состав госпитализированных детей и партии диагностических наборов, а число пациентов в каждом периоде слишком мало для их отдельного сравнения. Контрольной группы не было. Панель островковых аутоантител была неполной: ICA и антитела к IA-2 и ZnT8 не определяли. С-пептид и генетическое обследование не проводили, поэтому моногенный диабет исключали только клинически. Время взятия крови относительно начала инсулинотерапии не фиксировали, что затрудняет интерпретацию АТ-IAA. Дети с ранее известными заболеваниями щитовидной железы не включались, что могло занизить частоту тиреоидной патологии. Аутоиммунный тиреоидит не верифицировали, а функцию щитовидной железы оценивали однократно при установлении диагноза.</w:t>
       </w:r>
     </w:p>
     <w:p>

</xml_diff>

<commit_message>
Correct Uzbek abstract after three-way language review
Define AT-GAD/AT-IAA/AT-TPO, name the centre, fix the ordinal year
suffix (-yillarda), clarify that free T4 was measured only when TSH was
elevated, and fix case agreement and wording in the conclusion.

Co-Authored-By: Claude Opus 5.5 <noreply@anthropic.com>
Claude-Session: https://claude.ai/code/session_01Bi2cfojWAwQft33j1pXos8
</commit_message>
<xml_diff>
--- a/Статья_исправленная.docx
+++ b/Статья_исправленная.docx
@@ -237,7 +237,7 @@
         <w:t xml:space="preserve">Maqsad.</w:t>
       </w:r>
       <w:r>
-        <w:t xml:space="preserve"> Birinchi marta aniqlangan 1-tur qandli diabetli bolalarda GAD65, insulin va tireoperoksidazaga qarshi autoantitanalarning aniqlanish chastotasini baholash. </w:t>
+        <w:t xml:space="preserve"> Birinchi marta aniqlangan 1-tur qandli diabetli bolalarda GAD65, insulin va tireoperoksidazaga qarshi autoantitanalarning (mos ravishda AT-GAD, AT-IAA va AT-TPO) aniqlanish chastotasini baholash. </w:t>
       </w:r>
       <w:r>
         <w:rPr>
@@ -247,7 +247,7 @@
         <w:t xml:space="preserve">Material va usullar.</w:t>
       </w:r>
       <w:r>
-        <w:t xml:space="preserve"> Toshkentdagi bir markazli kuzatuv tadqiqotiga 2021-2022 va 2025-2026 yillarda 5-16 yoshli 38 nafar bola kiritildi. Autoantitanalar immunoferment usulida aniqlandi. Qo‘shimcha ravishda TTG, 25(OH)D va HbA1c, TTG oshganda erkin T4 tekshirildi. Ulushlar uchun 95% ishonch oraliqlari Uilson usulida hisoblandi. </w:t>
+        <w:t xml:space="preserve"> Bir markazli kuzatuv tadqiqotiga 2021-2022 va 2025-2026-yillarda Toshkentdagi ixtisoslashtirilgan endokrinologiya markaziga yotqizilgan 5-16 yoshli 38 nafar bola kiritildi. Autoantitanalar immunoferment usulida aniqlandi. Qo‘shimcha ravishda TTG, 25(OH)D va HbA1c, TTG oshgan hollarda esa erkin T4 ham tekshirildi. Ulushlar uchun 95% ishonch oraliqlari Uilson usulida hisoblandi. </w:t>
       </w:r>
       <w:r>
         <w:rPr>
@@ -267,7 +267,7 @@
         <w:t xml:space="preserve">Xulosa.</w:t>
       </w:r>
       <w:r>
-        <w:t xml:space="preserve"> AT-GAD va AT-IAA ko‘pchilik nashrlardagi ko‘rsatkichlarga nisbatan kamroq aniqlandi. Natijalarni baholashda tekshiruv usuli va markerlar paneli to‘liq emasligini hisobga olish kerak. Qon olish vaqti insulinoterapiya boshlanishiga nisbatan qayd etilmagani sababli AT-IAA natijalarini ehtiyotkorlik bilan baholash lozim. Natijalar faqat bitta markazga tegishli. Tashxis qo‘yilganda tireoid holatni baholash zarur.</w:t>
+        <w:t xml:space="preserve"> AT-GAD va AT-IAA ko‘pchilik nashrlardagi ko‘rsatkichlarga nisbatan kamroq aniqlandi. Natijalarni baholashda tekshiruv usulini va markerlar paneli to‘liq emasligini hisobga olish kerak. Qon olish vaqti insulinoterapiya boshlanishiga nisbatan qayd etilmagani sababli AT-IAA natijalarini ehtiyotkorlik bilan talqin qilish lozim. Ma’lumotlar bitta markazda olingan. Tashxis qo‘yilganda tireoid holatni baholash zarur.</w:t>
       </w:r>
     </w:p>
     <w:p>

</xml_diff>